<commit_message>
remove typo and render
</commit_message>
<xml_diff>
--- a/recreation_methods/recreation_methods.docx
+++ b/recreation_methods/recreation_methods.docx
@@ -7,13 +7,7 @@
         <w:pStyle w:val="Title"/>
       </w:pPr>
       <w:r>
-        <w:t xml:space="preserve">Supplementary</w:t>
-      </w:r>
-      <w:r>
-        <w:t xml:space="preserve"> </w:t>
-      </w:r>
-      <w:r>
-        <w:t xml:space="preserve">Information</w:t>
+        <w:t xml:space="preserve">Supplementary Information</w:t>
       </w:r>
     </w:p>
     <w:p>
@@ -21,49 +15,7 @@
         <w:pStyle w:val="Subtitle"/>
       </w:pPr>
       <w:r>
-        <w:t xml:space="preserve">Recreation</w:t>
-      </w:r>
-      <w:r>
-        <w:t xml:space="preserve"> </w:t>
-      </w:r>
-      <w:r>
-        <w:t xml:space="preserve">(Recreation</w:t>
-      </w:r>
-      <w:r>
-        <w:t xml:space="preserve"> </w:t>
-      </w:r>
-      <w:r>
-        <w:t xml:space="preserve">from</w:t>
-      </w:r>
-      <w:r>
-        <w:t xml:space="preserve"> </w:t>
-      </w:r>
-      <w:r>
-        <w:t xml:space="preserve">Home</w:t>
-      </w:r>
-      <w:r>
-        <w:t xml:space="preserve"> </w:t>
-      </w:r>
-      <w:r>
-        <w:t xml:space="preserve">and</w:t>
-      </w:r>
-      <w:r>
-        <w:t xml:space="preserve"> </w:t>
-      </w:r>
-      <w:r>
-        <w:t xml:space="preserve">Recreation</w:t>
-      </w:r>
-      <w:r>
-        <w:t xml:space="preserve"> </w:t>
-      </w:r>
-      <w:r>
-        <w:t xml:space="preserve">from</w:t>
-      </w:r>
-      <w:r>
-        <w:t xml:space="preserve"> </w:t>
-      </w:r>
-      <w:r>
-        <w:t xml:space="preserve">Lodging)</w:t>
+        <w:t xml:space="preserve">Recreation (Recreation from Home and Recreation from Lodging)</w:t>
       </w:r>
     </w:p>
     <w:p>
@@ -71,13 +23,7 @@
         <w:pStyle w:val="Author"/>
       </w:pPr>
       <w:r>
-        <w:t xml:space="preserve">Matt</w:t>
-      </w:r>
-      <w:r>
-        <w:t xml:space="preserve"> </w:t>
-      </w:r>
-      <w:r>
-        <w:t xml:space="preserve">Braaksma</w:t>
+        <w:t xml:space="preserve">Matt Braaksma</w:t>
       </w:r>
     </w:p>
     <w:p>
@@ -85,13 +31,7 @@
         <w:pStyle w:val="Author"/>
       </w:pPr>
       <w:r>
-        <w:t xml:space="preserve">Spencer</w:t>
-      </w:r>
-      <w:r>
-        <w:t xml:space="preserve"> </w:t>
-      </w:r>
-      <w:r>
-        <w:t xml:space="preserve">Wood</w:t>
+        <w:t xml:space="preserve">Spencer Wood</w:t>
       </w:r>
     </w:p>
     <w:p>
@@ -99,13 +39,7 @@
         <w:pStyle w:val="Author"/>
       </w:pPr>
       <w:r>
-        <w:t xml:space="preserve">Lifeng</w:t>
-      </w:r>
-      <w:r>
-        <w:t xml:space="preserve"> </w:t>
-      </w:r>
-      <w:r>
-        <w:t xml:space="preserve">Ren</w:t>
+        <w:t xml:space="preserve">Lifeng Ren</w:t>
       </w:r>
     </w:p>
     <w:p>
@@ -113,13 +47,7 @@
         <w:pStyle w:val="Author"/>
       </w:pPr>
       <w:r>
-        <w:t xml:space="preserve">Ryan</w:t>
-      </w:r>
-      <w:r>
-        <w:t xml:space="preserve"> </w:t>
-      </w:r>
-      <w:r>
-        <w:t xml:space="preserve">McWay</w:t>
+        <w:t xml:space="preserve">Ryan McWay</w:t>
       </w:r>
     </w:p>
     <w:sdt>
@@ -135,19 +63,7 @@
             <w:pStyle w:val="TOCHeading"/>
           </w:pPr>
           <w:r>
-            <w:t xml:space="preserve">Table</w:t>
-          </w:r>
-          <w:r>
-            <w:t xml:space="preserve"> </w:t>
-          </w:r>
-          <w:r>
-            <w:t xml:space="preserve">of</w:t>
-          </w:r>
-          <w:r>
-            <w:t xml:space="preserve"> </w:t>
-          </w:r>
-          <w:r>
-            <w:t xml:space="preserve">contents</w:t>
+            <w:t xml:space="preserve">Table of contents</w:t>
           </w:r>
         </w:p>
         <w:p>
@@ -181,8 +97,8 @@
       </w:r>
       <w:r>
         <w:rPr>
+          <w:b/>
           <w:bCs/>
-          <w:b/>
         </w:rPr>
         <w:t xml:space="preserve">Recreation from Home</w:t>
       </w:r>
@@ -197,8 +113,8 @@
       </w:r>
       <w:r>
         <w:rPr>
+          <w:b/>
           <w:bCs/>
-          <w:b/>
         </w:rPr>
         <w:t xml:space="preserve">Recreation from Lodging</w:t>
       </w:r>
@@ -234,13 +150,7 @@
         <w:t xml:space="preserve"> </w:t>
       </w:r>
       <w:r>
-        <w:t xml:space="preserve">“</w:t>
-      </w:r>
-      <w:r>
-        <w:t xml:space="preserve">Recreation-related services are contributions of ecosystems, in particular through their biophysical characteristics and qualities, that enable people to use and enjoy the environment through direct, in situ, physical and experiential interactions with the environment. These include services both to locals and to non-locals (i.e. visitors, including tourists). Recreation-related services may also be supplied to those engaging in recreational fishing or hunting. These are final ecosystem services.</w:t>
-      </w:r>
-      <w:r>
-        <w:t xml:space="preserve">”</w:t>
+        <w:t xml:space="preserve">“Recreation-related services are contributions of ecosystems, in particular through their biophysical characteristics and qualities, that enable people to use and enjoy the environment through direct, in situ, physical and experiential interactions with the environment. These include services both to locals and to non-locals (i.e. visitors, including tourists). Recreation-related services may also be supplied to those engaging in recreational fishing or hunting. These are final ecosystem services.”</w:t>
       </w:r>
       <w:r>
         <w:t xml:space="preserve"> </w:t>
@@ -303,9 +213,8 @@
       <w:tblPr>
         <w:tblStyle w:val="Table"/>
         <w:tblW w:type="pct" w:w="5000"/>
+        <w:tblLayout w:type="fixed"/>
         <w:tblLook w:firstRow="0" w:lastRow="0" w:firstColumn="0" w:lastColumn="0" w:noHBand="0" w:noVBand="0" w:val="0000"/>
-        <w:jc w:val="start"/>
-        <w:tblLayout w:type="fixed"/>
       </w:tblPr>
       <w:tblGrid>
         <w:gridCol w:w="7920"/>
@@ -367,7 +276,7 @@
               <w:jc w:val="center"/>
             </w:pPr>
             <w:pPr>
-              <w:jc w:val="start"/>
+              <w:jc w:val="left"/>
               <w:spacing w:before="200"/>
               <w:pStyle w:val="ImageCaption"/>
             </w:pPr>
@@ -436,9 +345,8 @@
       <w:tblPr>
         <w:tblStyle w:val="Table"/>
         <w:tblW w:type="pct" w:w="5000"/>
+        <w:tblLayout w:type="fixed"/>
         <w:tblLook w:firstRow="0" w:lastRow="0" w:firstColumn="0" w:lastColumn="0" w:noHBand="0" w:noVBand="0" w:val="0000"/>
-        <w:jc w:val="start"/>
-        <w:tblLayout w:type="fixed"/>
       </w:tblPr>
       <w:tblGrid>
         <w:gridCol w:w="7920"/>
@@ -452,7 +360,7 @@
               <w:jc w:val="center"/>
             </w:pPr>
             <w:pPr>
-              <w:jc w:val="start"/>
+              <w:jc w:val="left"/>
               <w:spacing w:before="200"/>
               <w:pStyle w:val="ImageCaption"/>
             </w:pPr>
@@ -465,7 +373,6 @@
               <w:tblStyle w:val="Table"/>
               <w:tblW w:type="auto" w:w="0"/>
               <w:tblLook w:firstRow="1" w:lastRow="0" w:firstColumn="0" w:lastColumn="0" w:noHBand="0" w:noVBand="0" w:val="0020"/>
-              <w:jc w:val="start"/>
             </w:tblPr>
             <w:tblGrid>
               <w:gridCol w:w="3960"/>
@@ -473,14 +380,13 @@
             </w:tblGrid>
             <w:tr>
               <w:trPr>
-                <w:tblHeader w:val="true"/>
+                <w:tblHeader w:val="on"/>
               </w:trPr>
               <w:tc>
                 <w:tcPr/>
                 <w:p>
                   <w:pPr>
                     <w:pStyle w:val="Compact"/>
-                    <w:jc w:val="left"/>
                     <w:jc w:val="center"/>
                   </w:pPr>
                   <w:r>
@@ -493,7 +399,6 @@
                 <w:p>
                   <w:pPr>
                     <w:pStyle w:val="Compact"/>
-                    <w:jc w:val="left"/>
                     <w:jc w:val="center"/>
                   </w:pPr>
                   <w:r>
@@ -508,7 +413,6 @@
                 <w:p>
                   <w:pPr>
                     <w:pStyle w:val="Compact"/>
-                    <w:jc w:val="left"/>
                     <w:jc w:val="center"/>
                   </w:pPr>
                   <w:r>
@@ -521,7 +425,6 @@
                 <w:p>
                   <w:pPr>
                     <w:pStyle w:val="Compact"/>
-                    <w:jc w:val="left"/>
                     <w:jc w:val="center"/>
                   </w:pPr>
                   <w:r>
@@ -536,7 +439,6 @@
                 <w:p>
                   <w:pPr>
                     <w:pStyle w:val="Compact"/>
-                    <w:jc w:val="left"/>
                     <w:jc w:val="center"/>
                   </w:pPr>
                   <w:r>
@@ -549,7 +451,6 @@
                 <w:p>
                   <w:pPr>
                     <w:pStyle w:val="Compact"/>
-                    <w:jc w:val="left"/>
                     <w:jc w:val="center"/>
                   </w:pPr>
                   <w:r>
@@ -564,7 +465,6 @@
                 <w:p>
                   <w:pPr>
                     <w:pStyle w:val="Compact"/>
-                    <w:jc w:val="left"/>
                     <w:jc w:val="center"/>
                   </w:pPr>
                   <w:r>
@@ -577,7 +477,6 @@
                 <w:p>
                   <w:pPr>
                     <w:pStyle w:val="Compact"/>
-                    <w:jc w:val="left"/>
                     <w:jc w:val="center"/>
                   </w:pPr>
                   <w:r>
@@ -592,7 +491,6 @@
                 <w:p>
                   <w:pPr>
                     <w:pStyle w:val="Compact"/>
-                    <w:jc w:val="left"/>
                     <w:jc w:val="center"/>
                   </w:pPr>
                   <w:r>
@@ -605,7 +503,6 @@
                 <w:p>
                   <w:pPr>
                     <w:pStyle w:val="Compact"/>
-                    <w:jc w:val="left"/>
                     <w:jc w:val="center"/>
                   </w:pPr>
                   <w:r>
@@ -620,7 +517,6 @@
                 <w:p>
                   <w:pPr>
                     <w:pStyle w:val="Compact"/>
-                    <w:jc w:val="left"/>
                     <w:jc w:val="center"/>
                   </w:pPr>
                   <w:r>
@@ -633,7 +529,6 @@
                 <w:p>
                   <w:pPr>
                     <w:pStyle w:val="Compact"/>
-                    <w:jc w:val="left"/>
                     <w:jc w:val="center"/>
                   </w:pPr>
                   <w:r>
@@ -648,7 +543,6 @@
                 <w:p>
                   <w:pPr>
                     <w:pStyle w:val="Compact"/>
-                    <w:jc w:val="left"/>
                     <w:jc w:val="center"/>
                   </w:pPr>
                   <w:r>
@@ -661,7 +555,6 @@
                 <w:p>
                   <w:pPr>
                     <w:pStyle w:val="Compact"/>
-                    <w:jc w:val="left"/>
                     <w:jc w:val="center"/>
                   </w:pPr>
                   <w:r>
@@ -676,7 +569,6 @@
                 <w:p>
                   <w:pPr>
                     <w:pStyle w:val="Compact"/>
-                    <w:jc w:val="left"/>
                     <w:jc w:val="center"/>
                   </w:pPr>
                   <w:r>
@@ -689,7 +581,6 @@
                 <w:p>
                   <w:pPr>
                     <w:pStyle w:val="Compact"/>
-                    <w:jc w:val="left"/>
                     <w:jc w:val="center"/>
                   </w:pPr>
                   <w:r>
@@ -704,7 +595,6 @@
                 <w:p>
                   <w:pPr>
                     <w:pStyle w:val="Compact"/>
-                    <w:jc w:val="left"/>
                     <w:jc w:val="center"/>
                   </w:pPr>
                   <w:r>
@@ -717,7 +607,6 @@
                 <w:p>
                   <w:pPr>
                     <w:pStyle w:val="Compact"/>
-                    <w:jc w:val="left"/>
                     <w:jc w:val="center"/>
                   </w:pPr>
                   <w:r>
@@ -771,8 +660,8 @@
           <m:d>
             <m:dPr>
               <m:begChr m:val="("/>
+              <m:sepChr m:val=""/>
               <m:endChr m:val=")"/>
-              <m:sepChr m:val=""/>
               <m:grow/>
             </m:dPr>
             <m:e>
@@ -807,8 +696,8 @@
           <m:d>
             <m:dPr>
               <m:begChr m:val="("/>
+              <m:sepChr m:val=""/>
               <m:endChr m:val=")"/>
-              <m:sepChr m:val=""/>
               <m:grow/>
             </m:dPr>
             <m:e>
@@ -884,9 +773,8 @@
       <w:tblPr>
         <w:tblStyle w:val="Table"/>
         <w:tblW w:type="pct" w:w="5000"/>
+        <w:tblLayout w:type="fixed"/>
         <w:tblLook w:firstRow="0" w:lastRow="0" w:firstColumn="0" w:lastColumn="0" w:noHBand="0" w:noVBand="0" w:val="0000"/>
-        <w:jc w:val="start"/>
-        <w:tblLayout w:type="fixed"/>
       </w:tblPr>
       <w:tblGrid>
         <w:gridCol w:w="7920"/>
@@ -900,7 +788,7 @@
               <w:jc w:val="center"/>
             </w:pPr>
             <w:pPr>
-              <w:jc w:val="start"/>
+              <w:jc w:val="left"/>
               <w:spacing w:before="200"/>
               <w:pStyle w:val="ImageCaption"/>
             </w:pPr>
@@ -913,7 +801,6 @@
               <w:tblStyle w:val="Table"/>
               <w:tblW w:type="auto" w:w="0"/>
               <w:tblLook w:firstRow="1" w:lastRow="0" w:firstColumn="0" w:lastColumn="0" w:noHBand="0" w:noVBand="0" w:val="0020"/>
-              <w:jc w:val="start"/>
             </w:tblPr>
             <w:tblGrid>
               <w:gridCol w:w="2640"/>
@@ -922,14 +809,13 @@
             </w:tblGrid>
             <w:tr>
               <w:trPr>
-                <w:tblHeader w:val="true"/>
+                <w:tblHeader w:val="on"/>
               </w:trPr>
               <w:tc>
                 <w:tcPr/>
                 <w:p>
                   <w:pPr>
                     <w:pStyle w:val="Compact"/>
-                    <w:jc w:val="left"/>
                     <w:jc w:val="center"/>
                   </w:pPr>
                   <w:r>
@@ -942,7 +828,6 @@
                 <w:p>
                   <w:pPr>
                     <w:pStyle w:val="Compact"/>
-                    <w:jc w:val="left"/>
                     <w:jc w:val="center"/>
                   </w:pPr>
                   <w:r>
@@ -955,7 +840,6 @@
                 <w:p>
                   <w:pPr>
                     <w:pStyle w:val="Compact"/>
-                    <w:jc w:val="left"/>
                     <w:jc w:val="center"/>
                   </w:pPr>
                   <w:r>
@@ -970,7 +854,6 @@
                 <w:p>
                   <w:pPr>
                     <w:pStyle w:val="Compact"/>
-                    <w:jc w:val="left"/>
                     <w:jc w:val="center"/>
                   </w:pPr>
                   <w:r>
@@ -983,7 +866,6 @@
                 <w:p>
                   <w:pPr>
                     <w:pStyle w:val="Compact"/>
-                    <w:jc w:val="left"/>
                     <w:jc w:val="center"/>
                   </w:pPr>
                   <w:r>
@@ -996,7 +878,6 @@
                 <w:p>
                   <w:pPr>
                     <w:pStyle w:val="Compact"/>
-                    <w:jc w:val="left"/>
                     <w:jc w:val="center"/>
                   </w:pPr>
                   <w:r>
@@ -1011,7 +892,6 @@
                 <w:p>
                   <w:pPr>
                     <w:pStyle w:val="Compact"/>
-                    <w:jc w:val="left"/>
                     <w:jc w:val="center"/>
                   </w:pPr>
                   <w:r>
@@ -1024,7 +904,6 @@
                 <w:p>
                   <w:pPr>
                     <w:pStyle w:val="Compact"/>
-                    <w:jc w:val="left"/>
                     <w:jc w:val="center"/>
                   </w:pPr>
                   <w:r>
@@ -1037,7 +916,6 @@
                 <w:p>
                   <w:pPr>
                     <w:pStyle w:val="Compact"/>
-                    <w:jc w:val="left"/>
                     <w:jc w:val="center"/>
                   </w:pPr>
                   <w:r>
@@ -1052,7 +930,6 @@
                 <w:p>
                   <w:pPr>
                     <w:pStyle w:val="Compact"/>
-                    <w:jc w:val="left"/>
                     <w:jc w:val="center"/>
                   </w:pPr>
                   <w:r>
@@ -1065,7 +942,6 @@
                 <w:p>
                   <w:pPr>
                     <w:pStyle w:val="Compact"/>
-                    <w:jc w:val="left"/>
                     <w:jc w:val="center"/>
                   </w:pPr>
                   <w:r>
@@ -1078,7 +954,6 @@
                 <w:p>
                   <w:pPr>
                     <w:pStyle w:val="Compact"/>
-                    <w:jc w:val="left"/>
                     <w:jc w:val="center"/>
                   </w:pPr>
                   <w:r>
@@ -1093,7 +968,6 @@
                 <w:p>
                   <w:pPr>
                     <w:pStyle w:val="Compact"/>
-                    <w:jc w:val="left"/>
                     <w:jc w:val="center"/>
                   </w:pPr>
                   <w:r>
@@ -1106,7 +980,6 @@
                 <w:p>
                   <w:pPr>
                     <w:pStyle w:val="Compact"/>
-                    <w:jc w:val="left"/>
                     <w:jc w:val="center"/>
                   </w:pPr>
                   <w:r>
@@ -1119,7 +992,6 @@
                 <w:p>
                   <w:pPr>
                     <w:pStyle w:val="Compact"/>
-                    <w:jc w:val="left"/>
                     <w:jc w:val="center"/>
                   </w:pPr>
                   <w:r>
@@ -1134,7 +1006,6 @@
                 <w:p>
                   <w:pPr>
                     <w:pStyle w:val="Compact"/>
-                    <w:jc w:val="left"/>
                     <w:jc w:val="center"/>
                   </w:pPr>
                   <w:r>
@@ -1147,7 +1018,6 @@
                 <w:p>
                   <w:pPr>
                     <w:pStyle w:val="Compact"/>
-                    <w:jc w:val="left"/>
                     <w:jc w:val="center"/>
                   </w:pPr>
                   <w:r>
@@ -1160,7 +1030,6 @@
                 <w:p>
                   <w:pPr>
                     <w:pStyle w:val="Compact"/>
-                    <w:jc w:val="left"/>
                     <w:jc w:val="center"/>
                   </w:pPr>
                   <w:r>
@@ -1187,9 +1056,8 @@
       <w:tblPr>
         <w:tblStyle w:val="Table"/>
         <w:tblW w:type="pct" w:w="5000"/>
+        <w:tblLayout w:type="fixed"/>
         <w:tblLook w:firstRow="0" w:lastRow="0" w:firstColumn="0" w:lastColumn="0" w:noHBand="0" w:noVBand="0" w:val="0000"/>
-        <w:jc w:val="start"/>
-        <w:tblLayout w:type="fixed"/>
       </w:tblPr>
       <w:tblGrid>
         <w:gridCol w:w="7920"/>
@@ -1203,7 +1071,7 @@
               <w:jc w:val="center"/>
             </w:pPr>
             <w:pPr>
-              <w:jc w:val="start"/>
+              <w:jc w:val="left"/>
               <w:spacing w:before="200"/>
               <w:pStyle w:val="ImageCaption"/>
             </w:pPr>
@@ -1216,7 +1084,6 @@
               <w:tblStyle w:val="Table"/>
               <w:tblW w:type="auto" w:w="0"/>
               <w:tblLook w:firstRow="1" w:lastRow="0" w:firstColumn="0" w:lastColumn="0" w:noHBand="0" w:noVBand="0" w:val="0020"/>
-              <w:jc w:val="start"/>
             </w:tblPr>
             <w:tblGrid>
               <w:gridCol w:w="1320"/>
@@ -1228,14 +1095,13 @@
             </w:tblGrid>
             <w:tr>
               <w:trPr>
-                <w:tblHeader w:val="true"/>
+                <w:tblHeader w:val="on"/>
               </w:trPr>
               <w:tc>
                 <w:tcPr/>
                 <w:p>
                   <w:pPr>
                     <w:pStyle w:val="Compact"/>
-                    <w:jc w:val="left"/>
                     <w:jc w:val="center"/>
                   </w:pPr>
                   <w:r>
@@ -1248,7 +1114,6 @@
                 <w:p>
                   <w:pPr>
                     <w:pStyle w:val="Compact"/>
-                    <w:jc w:val="left"/>
                     <w:jc w:val="center"/>
                   </w:pPr>
                   <w:r>
@@ -1261,7 +1126,6 @@
                 <w:p>
                   <w:pPr>
                     <w:pStyle w:val="Compact"/>
-                    <w:jc w:val="left"/>
                     <w:jc w:val="center"/>
                   </w:pPr>
                   <w:r>
@@ -1274,7 +1138,6 @@
                 <w:p>
                   <w:pPr>
                     <w:pStyle w:val="Compact"/>
-                    <w:jc w:val="left"/>
                     <w:jc w:val="center"/>
                   </w:pPr>
                   <w:r>
@@ -1287,7 +1150,6 @@
                 <w:p>
                   <w:pPr>
                     <w:pStyle w:val="Compact"/>
-                    <w:jc w:val="left"/>
                     <w:jc w:val="center"/>
                   </w:pPr>
                   <w:r>
@@ -1300,7 +1162,6 @@
                 <w:p>
                   <w:pPr>
                     <w:pStyle w:val="Compact"/>
-                    <w:jc w:val="left"/>
                     <w:jc w:val="center"/>
                   </w:pPr>
                   <w:r>
@@ -1315,13 +1176,12 @@
                 <w:p>
                   <w:pPr>
                     <w:pStyle w:val="Compact"/>
-                    <w:jc w:val="left"/>
                     <w:jc w:val="center"/>
                   </w:pPr>
                   <w:r>
                     <w:rPr>
+                      <w:b/>
                       <w:bCs/>
-                      <w:b/>
                     </w:rPr>
                     <w:t xml:space="preserve">Low</w:t>
                   </w:r>
@@ -1332,7 +1192,6 @@
                 <w:p>
                   <w:pPr>
                     <w:pStyle w:val="Compact"/>
-                    <w:jc w:val="left"/>
                     <w:jc w:val="center"/>
                   </w:pPr>
                   <w:r>
@@ -1345,7 +1204,6 @@
                 <w:p>
                   <w:pPr>
                     <w:pStyle w:val="Compact"/>
-                    <w:jc w:val="left"/>
                     <w:jc w:val="center"/>
                   </w:pPr>
                   <w:r>
@@ -1358,7 +1216,6 @@
                 <w:p>
                   <w:pPr>
                     <w:pStyle w:val="Compact"/>
-                    <w:jc w:val="left"/>
                     <w:jc w:val="center"/>
                   </w:pPr>
                   <w:r>
@@ -1371,7 +1228,6 @@
                 <w:p>
                   <w:pPr>
                     <w:pStyle w:val="Compact"/>
-                    <w:jc w:val="left"/>
                     <w:jc w:val="center"/>
                   </w:pPr>
                   <w:r>
@@ -1384,7 +1240,6 @@
                 <w:p>
                   <w:pPr>
                     <w:pStyle w:val="Compact"/>
-                    <w:jc w:val="left"/>
                     <w:jc w:val="center"/>
                   </w:pPr>
                   <w:r>
@@ -1399,13 +1254,12 @@
                 <w:p>
                   <w:pPr>
                     <w:pStyle w:val="Compact"/>
-                    <w:jc w:val="left"/>
                     <w:jc w:val="center"/>
                   </w:pPr>
                   <w:r>
                     <w:rPr>
+                      <w:b/>
                       <w:bCs/>
-                      <w:b/>
                     </w:rPr>
                     <w:t xml:space="preserve">Medium-Low</w:t>
                   </w:r>
@@ -1416,7 +1270,6 @@
                 <w:p>
                   <w:pPr>
                     <w:pStyle w:val="Compact"/>
-                    <w:jc w:val="left"/>
                     <w:jc w:val="center"/>
                   </w:pPr>
                   <w:r>
@@ -1429,7 +1282,6 @@
                 <w:p>
                   <w:pPr>
                     <w:pStyle w:val="Compact"/>
-                    <w:jc w:val="left"/>
                     <w:jc w:val="center"/>
                   </w:pPr>
                   <w:r>
@@ -1442,7 +1294,6 @@
                 <w:p>
                   <w:pPr>
                     <w:pStyle w:val="Compact"/>
-                    <w:jc w:val="left"/>
                     <w:jc w:val="center"/>
                   </w:pPr>
                   <w:r>
@@ -1455,7 +1306,6 @@
                 <w:p>
                   <w:pPr>
                     <w:pStyle w:val="Compact"/>
-                    <w:jc w:val="left"/>
                     <w:jc w:val="center"/>
                   </w:pPr>
                   <w:r>
@@ -1468,7 +1318,6 @@
                 <w:p>
                   <w:pPr>
                     <w:pStyle w:val="Compact"/>
-                    <w:jc w:val="left"/>
                     <w:jc w:val="center"/>
                   </w:pPr>
                   <w:r>
@@ -1483,13 +1332,12 @@
                 <w:p>
                   <w:pPr>
                     <w:pStyle w:val="Compact"/>
-                    <w:jc w:val="left"/>
                     <w:jc w:val="center"/>
                   </w:pPr>
                   <w:r>
                     <w:rPr>
+                      <w:b/>
                       <w:bCs/>
-                      <w:b/>
                     </w:rPr>
                     <w:t xml:space="preserve">Medium</w:t>
                   </w:r>
@@ -1500,7 +1348,6 @@
                 <w:p>
                   <w:pPr>
                     <w:pStyle w:val="Compact"/>
-                    <w:jc w:val="left"/>
                     <w:jc w:val="center"/>
                   </w:pPr>
                   <w:r>
@@ -1513,7 +1360,6 @@
                 <w:p>
                   <w:pPr>
                     <w:pStyle w:val="Compact"/>
-                    <w:jc w:val="left"/>
                     <w:jc w:val="center"/>
                   </w:pPr>
                   <w:r>
@@ -1526,7 +1372,6 @@
                 <w:p>
                   <w:pPr>
                     <w:pStyle w:val="Compact"/>
-                    <w:jc w:val="left"/>
                     <w:jc w:val="center"/>
                   </w:pPr>
                   <w:r>
@@ -1539,7 +1384,6 @@
                 <w:p>
                   <w:pPr>
                     <w:pStyle w:val="Compact"/>
-                    <w:jc w:val="left"/>
                     <w:jc w:val="center"/>
                   </w:pPr>
                   <w:r>
@@ -1552,7 +1396,6 @@
                 <w:p>
                   <w:pPr>
                     <w:pStyle w:val="Compact"/>
-                    <w:jc w:val="left"/>
                     <w:jc w:val="center"/>
                   </w:pPr>
                   <w:r>
@@ -1567,13 +1410,12 @@
                 <w:p>
                   <w:pPr>
                     <w:pStyle w:val="Compact"/>
-                    <w:jc w:val="left"/>
                     <w:jc w:val="center"/>
                   </w:pPr>
                   <w:r>
                     <w:rPr>
+                      <w:b/>
                       <w:bCs/>
-                      <w:b/>
                     </w:rPr>
                     <w:t xml:space="preserve">Medium-High</w:t>
                   </w:r>
@@ -1584,7 +1426,6 @@
                 <w:p>
                   <w:pPr>
                     <w:pStyle w:val="Compact"/>
-                    <w:jc w:val="left"/>
                     <w:jc w:val="center"/>
                   </w:pPr>
                   <w:r>
@@ -1597,7 +1438,6 @@
                 <w:p>
                   <w:pPr>
                     <w:pStyle w:val="Compact"/>
-                    <w:jc w:val="left"/>
                     <w:jc w:val="center"/>
                   </w:pPr>
                   <w:r>
@@ -1610,7 +1450,6 @@
                 <w:p>
                   <w:pPr>
                     <w:pStyle w:val="Compact"/>
-                    <w:jc w:val="left"/>
                     <w:jc w:val="center"/>
                   </w:pPr>
                   <w:r>
@@ -1623,7 +1462,6 @@
                 <w:p>
                   <w:pPr>
                     <w:pStyle w:val="Compact"/>
-                    <w:jc w:val="left"/>
                     <w:jc w:val="center"/>
                   </w:pPr>
                   <w:r>
@@ -1636,7 +1474,6 @@
                 <w:p>
                   <w:pPr>
                     <w:pStyle w:val="Compact"/>
-                    <w:jc w:val="left"/>
                     <w:jc w:val="center"/>
                   </w:pPr>
                   <w:r>
@@ -1651,13 +1488,12 @@
                 <w:p>
                   <w:pPr>
                     <w:pStyle w:val="Compact"/>
-                    <w:jc w:val="left"/>
                     <w:jc w:val="center"/>
                   </w:pPr>
                   <w:r>
                     <w:rPr>
+                      <w:b/>
                       <w:bCs/>
-                      <w:b/>
                     </w:rPr>
                     <w:t xml:space="preserve">High</w:t>
                   </w:r>
@@ -1668,7 +1504,6 @@
                 <w:p>
                   <w:pPr>
                     <w:pStyle w:val="Compact"/>
-                    <w:jc w:val="left"/>
                     <w:jc w:val="center"/>
                   </w:pPr>
                   <w:r>
@@ -1681,7 +1516,6 @@
                 <w:p>
                   <w:pPr>
                     <w:pStyle w:val="Compact"/>
-                    <w:jc w:val="left"/>
                     <w:jc w:val="center"/>
                   </w:pPr>
                   <w:r>
@@ -1694,7 +1528,6 @@
                 <w:p>
                   <w:pPr>
                     <w:pStyle w:val="Compact"/>
-                    <w:jc w:val="left"/>
                     <w:jc w:val="center"/>
                   </w:pPr>
                   <w:r>
@@ -1707,7 +1540,6 @@
                 <w:p>
                   <w:pPr>
                     <w:pStyle w:val="Compact"/>
-                    <w:jc w:val="left"/>
                     <w:jc w:val="center"/>
                   </w:pPr>
                   <w:r>
@@ -1720,7 +1552,6 @@
                 <w:p>
                   <w:pPr>
                     <w:pStyle w:val="Compact"/>
-                    <w:jc w:val="left"/>
                     <w:jc w:val="center"/>
                   </w:pPr>
                   <w:r>
@@ -1757,9 +1588,8 @@
       <w:tblPr>
         <w:tblStyle w:val="Table"/>
         <w:tblW w:type="pct" w:w="5000"/>
+        <w:tblLayout w:type="fixed"/>
         <w:tblLook w:firstRow="0" w:lastRow="0" w:firstColumn="0" w:lastColumn="0" w:noHBand="0" w:noVBand="0" w:val="0000"/>
-        <w:jc w:val="start"/>
-        <w:tblLayout w:type="fixed"/>
       </w:tblPr>
       <w:tblGrid>
         <w:gridCol w:w="7920"/>
@@ -1773,7 +1603,7 @@
               <w:jc w:val="center"/>
             </w:pPr>
             <w:pPr>
-              <w:jc w:val="start"/>
+              <w:jc w:val="left"/>
               <w:spacing w:before="200"/>
               <w:pStyle w:val="ImageCaption"/>
             </w:pPr>
@@ -1786,7 +1616,6 @@
               <w:tblStyle w:val="Table"/>
               <w:tblW w:type="auto" w:w="0"/>
               <w:tblLook w:firstRow="1" w:lastRow="0" w:firstColumn="0" w:lastColumn="0" w:noHBand="0" w:noVBand="0" w:val="0020"/>
-              <w:jc w:val="start"/>
             </w:tblPr>
             <w:tblGrid>
               <w:gridCol w:w="1584"/>
@@ -1797,14 +1626,13 @@
             </w:tblGrid>
             <w:tr>
               <w:trPr>
-                <w:tblHeader w:val="true"/>
+                <w:tblHeader w:val="on"/>
               </w:trPr>
               <w:tc>
                 <w:tcPr/>
                 <w:p>
                   <w:pPr>
                     <w:pStyle w:val="Compact"/>
-                    <w:jc w:val="left"/>
                     <w:jc w:val="center"/>
                   </w:pPr>
                   <w:r>
@@ -1817,7 +1645,6 @@
                 <w:p>
                   <w:pPr>
                     <w:pStyle w:val="Compact"/>
-                    <w:jc w:val="left"/>
                     <w:jc w:val="center"/>
                   </w:pPr>
                   <w:r>
@@ -1830,7 +1657,6 @@
                 <w:p>
                   <w:pPr>
                     <w:pStyle w:val="Compact"/>
-                    <w:jc w:val="left"/>
                     <w:jc w:val="center"/>
                   </w:pPr>
                   <w:r>
@@ -1843,7 +1669,6 @@
                 <w:p>
                   <w:pPr>
                     <w:pStyle w:val="Compact"/>
-                    <w:jc w:val="left"/>
                     <w:jc w:val="center"/>
                   </w:pPr>
                   <w:r>
@@ -1856,7 +1681,6 @@
                 <w:p>
                   <w:pPr>
                     <w:pStyle w:val="Compact"/>
-                    <w:jc w:val="left"/>
                     <w:jc w:val="center"/>
                   </w:pPr>
                   <w:r>
@@ -1871,13 +1695,12 @@
                 <w:p>
                   <w:pPr>
                     <w:pStyle w:val="Compact"/>
-                    <w:jc w:val="left"/>
                     <w:jc w:val="center"/>
                   </w:pPr>
                   <w:r>
                     <w:rPr>
+                      <w:b/>
                       <w:bCs/>
-                      <w:b/>
                     </w:rPr>
                     <w:t xml:space="preserve">Low</w:t>
                   </w:r>
@@ -1888,7 +1711,6 @@
                 <w:p>
                   <w:pPr>
                     <w:pStyle w:val="Compact"/>
-                    <w:jc w:val="left"/>
                     <w:jc w:val="center"/>
                   </w:pPr>
                   <w:r>
@@ -1901,7 +1723,6 @@
                 <w:p>
                   <w:pPr>
                     <w:pStyle w:val="Compact"/>
-                    <w:jc w:val="left"/>
                     <w:jc w:val="center"/>
                   </w:pPr>
                   <w:r>
@@ -1914,7 +1735,6 @@
                 <w:p>
                   <w:pPr>
                     <w:pStyle w:val="Compact"/>
-                    <w:jc w:val="left"/>
                     <w:jc w:val="center"/>
                   </w:pPr>
                   <w:r>
@@ -1927,7 +1747,6 @@
                 <w:p>
                   <w:pPr>
                     <w:pStyle w:val="Compact"/>
-                    <w:jc w:val="left"/>
                     <w:jc w:val="center"/>
                   </w:pPr>
                   <w:r>
@@ -1942,13 +1761,12 @@
                 <w:p>
                   <w:pPr>
                     <w:pStyle w:val="Compact"/>
-                    <w:jc w:val="left"/>
                     <w:jc w:val="center"/>
                   </w:pPr>
                   <w:r>
                     <w:rPr>
+                      <w:b/>
                       <w:bCs/>
-                      <w:b/>
                     </w:rPr>
                     <w:t xml:space="preserve">Medium-Low</w:t>
                   </w:r>
@@ -1959,7 +1777,6 @@
                 <w:p>
                   <w:pPr>
                     <w:pStyle w:val="Compact"/>
-                    <w:jc w:val="left"/>
                     <w:jc w:val="center"/>
                   </w:pPr>
                   <w:r>
@@ -1972,7 +1789,6 @@
                 <w:p>
                   <w:pPr>
                     <w:pStyle w:val="Compact"/>
-                    <w:jc w:val="left"/>
                     <w:jc w:val="center"/>
                   </w:pPr>
                   <w:r>
@@ -1985,7 +1801,6 @@
                 <w:p>
                   <w:pPr>
                     <w:pStyle w:val="Compact"/>
-                    <w:jc w:val="left"/>
                     <w:jc w:val="center"/>
                   </w:pPr>
                   <w:r>
@@ -1998,7 +1813,6 @@
                 <w:p>
                   <w:pPr>
                     <w:pStyle w:val="Compact"/>
-                    <w:jc w:val="left"/>
                     <w:jc w:val="center"/>
                   </w:pPr>
                   <w:r>
@@ -2013,13 +1827,12 @@
                 <w:p>
                   <w:pPr>
                     <w:pStyle w:val="Compact"/>
-                    <w:jc w:val="left"/>
                     <w:jc w:val="center"/>
                   </w:pPr>
                   <w:r>
                     <w:rPr>
+                      <w:b/>
                       <w:bCs/>
-                      <w:b/>
                     </w:rPr>
                     <w:t xml:space="preserve">Medium</w:t>
                   </w:r>
@@ -2030,7 +1843,6 @@
                 <w:p>
                   <w:pPr>
                     <w:pStyle w:val="Compact"/>
-                    <w:jc w:val="left"/>
                     <w:jc w:val="center"/>
                   </w:pPr>
                   <w:r>
@@ -2043,7 +1855,6 @@
                 <w:p>
                   <w:pPr>
                     <w:pStyle w:val="Compact"/>
-                    <w:jc w:val="left"/>
                     <w:jc w:val="center"/>
                   </w:pPr>
                   <w:r>
@@ -2056,7 +1867,6 @@
                 <w:p>
                   <w:pPr>
                     <w:pStyle w:val="Compact"/>
-                    <w:jc w:val="left"/>
                     <w:jc w:val="center"/>
                   </w:pPr>
                   <w:r>
@@ -2069,7 +1879,6 @@
                 <w:p>
                   <w:pPr>
                     <w:pStyle w:val="Compact"/>
-                    <w:jc w:val="left"/>
                     <w:jc w:val="center"/>
                   </w:pPr>
                   <w:r>
@@ -2084,13 +1893,12 @@
                 <w:p>
                   <w:pPr>
                     <w:pStyle w:val="Compact"/>
-                    <w:jc w:val="left"/>
                     <w:jc w:val="center"/>
                   </w:pPr>
                   <w:r>
                     <w:rPr>
+                      <w:b/>
                       <w:bCs/>
-                      <w:b/>
                     </w:rPr>
                     <w:t xml:space="preserve">Medium-High</w:t>
                   </w:r>
@@ -2101,7 +1909,6 @@
                 <w:p>
                   <w:pPr>
                     <w:pStyle w:val="Compact"/>
-                    <w:jc w:val="left"/>
                     <w:jc w:val="center"/>
                   </w:pPr>
                   <w:r>
@@ -2114,7 +1921,6 @@
                 <w:p>
                   <w:pPr>
                     <w:pStyle w:val="Compact"/>
-                    <w:jc w:val="left"/>
                     <w:jc w:val="center"/>
                   </w:pPr>
                   <w:r>
@@ -2127,7 +1933,6 @@
                 <w:p>
                   <w:pPr>
                     <w:pStyle w:val="Compact"/>
-                    <w:jc w:val="left"/>
                     <w:jc w:val="center"/>
                   </w:pPr>
                   <w:r>
@@ -2140,7 +1945,6 @@
                 <w:p>
                   <w:pPr>
                     <w:pStyle w:val="Compact"/>
-                    <w:jc w:val="left"/>
                     <w:jc w:val="center"/>
                   </w:pPr>
                   <w:r>
@@ -2155,13 +1959,12 @@
                 <w:p>
                   <w:pPr>
                     <w:pStyle w:val="Compact"/>
-                    <w:jc w:val="left"/>
                     <w:jc w:val="center"/>
                   </w:pPr>
                   <w:r>
                     <w:rPr>
+                      <w:b/>
                       <w:bCs/>
-                      <w:b/>
                     </w:rPr>
                     <w:t xml:space="preserve">High</w:t>
                   </w:r>
@@ -2172,7 +1975,6 @@
                 <w:p>
                   <w:pPr>
                     <w:pStyle w:val="Compact"/>
-                    <w:jc w:val="left"/>
                     <w:jc w:val="center"/>
                   </w:pPr>
                   <w:r>
@@ -2185,7 +1987,6 @@
                 <w:p>
                   <w:pPr>
                     <w:pStyle w:val="Compact"/>
-                    <w:jc w:val="left"/>
                     <w:jc w:val="center"/>
                   </w:pPr>
                   <w:r>
@@ -2198,7 +1999,6 @@
                 <w:p>
                   <w:pPr>
                     <w:pStyle w:val="Compact"/>
-                    <w:jc w:val="left"/>
                     <w:jc w:val="center"/>
                   </w:pPr>
                   <w:r>
@@ -2211,7 +2011,6 @@
                 <w:p>
                   <w:pPr>
                     <w:pStyle w:val="Compact"/>
-                    <w:jc w:val="left"/>
                     <w:jc w:val="center"/>
                   </w:pPr>
                   <w:r>
@@ -2336,8 +2135,8 @@
                   <m:d>
                     <m:dPr>
                       <m:begChr m:val="("/>
+                      <m:sepChr m:val=""/>
                       <m:endChr m:val=")"/>
-                      <m:sepChr m:val=""/>
                       <m:grow/>
                     </m:dPr>
                     <m:e>
@@ -2369,8 +2168,8 @@
                   <m:d>
                     <m:dPr>
                       <m:begChr m:val="("/>
+                      <m:sepChr m:val=""/>
                       <m:endChr m:val=")"/>
-                      <m:sepChr m:val=""/>
                       <m:grow/>
                     </m:dPr>
                     <m:e>
@@ -2476,9 +2275,8 @@
       <w:tblPr>
         <w:tblStyle w:val="Table"/>
         <w:tblW w:type="pct" w:w="5000"/>
+        <w:tblLayout w:type="fixed"/>
         <w:tblLook w:firstRow="0" w:lastRow="0" w:firstColumn="0" w:lastColumn="0" w:noHBand="0" w:noVBand="0" w:val="0000"/>
-        <w:jc w:val="start"/>
-        <w:tblLayout w:type="fixed"/>
       </w:tblPr>
       <w:tblGrid>
         <w:gridCol w:w="7920"/>
@@ -2492,7 +2290,7 @@
               <w:jc w:val="center"/>
             </w:pPr>
             <w:pPr>
-              <w:jc w:val="start"/>
+              <w:jc w:val="left"/>
               <w:spacing w:before="200"/>
               <w:pStyle w:val="ImageCaption"/>
             </w:pPr>
@@ -2505,7 +2303,6 @@
               <w:tblStyle w:val="Table"/>
               <w:tblW w:type="auto" w:w="0"/>
               <w:tblLook w:firstRow="1" w:lastRow="0" w:firstColumn="0" w:lastColumn="0" w:noHBand="0" w:noVBand="0" w:val="0020"/>
-              <w:jc w:val="start"/>
             </w:tblPr>
             <w:tblGrid>
               <w:gridCol w:w="2640"/>
@@ -2514,14 +2311,13 @@
             </w:tblGrid>
             <w:tr>
               <w:trPr>
-                <w:tblHeader w:val="true"/>
+                <w:tblHeader w:val="on"/>
               </w:trPr>
               <w:tc>
                 <w:tcPr/>
                 <w:p>
                   <w:pPr>
                     <w:pStyle w:val="Compact"/>
-                    <w:jc w:val="left"/>
                     <w:jc w:val="center"/>
                   </w:pPr>
                   <w:r>
@@ -2534,7 +2330,6 @@
                 <w:p>
                   <w:pPr>
                     <w:pStyle w:val="Compact"/>
-                    <w:jc w:val="left"/>
                     <w:jc w:val="center"/>
                   </w:pPr>
                   <m:oMath>
@@ -2558,7 +2353,6 @@
                 <w:p>
                   <w:pPr>
                     <w:pStyle w:val="Compact"/>
-                    <w:jc w:val="left"/>
                     <w:jc w:val="center"/>
                   </w:pPr>
                   <m:oMath>
@@ -2584,7 +2378,6 @@
                 <w:p>
                   <w:pPr>
                     <w:pStyle w:val="Compact"/>
-                    <w:jc w:val="left"/>
                     <w:jc w:val="center"/>
                   </w:pPr>
                   <w:r>
@@ -2597,7 +2390,6 @@
                 <w:p>
                   <w:pPr>
                     <w:pStyle w:val="Compact"/>
-                    <w:jc w:val="left"/>
                     <w:jc w:val="center"/>
                   </w:pPr>
                   <w:r>
@@ -2610,7 +2402,6 @@
                 <w:p>
                   <w:pPr>
                     <w:pStyle w:val="Compact"/>
-                    <w:jc w:val="left"/>
                     <w:jc w:val="center"/>
                   </w:pPr>
                   <w:r>
@@ -2625,7 +2416,6 @@
                 <w:p>
                   <w:pPr>
                     <w:pStyle w:val="Compact"/>
-                    <w:jc w:val="left"/>
                     <w:jc w:val="center"/>
                   </w:pPr>
                   <w:r>
@@ -2638,7 +2428,6 @@
                 <w:p>
                   <w:pPr>
                     <w:pStyle w:val="Compact"/>
-                    <w:jc w:val="left"/>
                     <w:jc w:val="center"/>
                   </w:pPr>
                   <w:r>
@@ -2651,7 +2440,6 @@
                 <w:p>
                   <w:pPr>
                     <w:pStyle w:val="Compact"/>
-                    <w:jc w:val="left"/>
                     <w:jc w:val="center"/>
                   </w:pPr>
                   <w:r>
@@ -2666,7 +2454,6 @@
                 <w:p>
                   <w:pPr>
                     <w:pStyle w:val="Compact"/>
-                    <w:jc w:val="left"/>
                     <w:jc w:val="center"/>
                   </w:pPr>
                   <w:r>
@@ -2679,7 +2466,6 @@
                 <w:p>
                   <w:pPr>
                     <w:pStyle w:val="Compact"/>
-                    <w:jc w:val="left"/>
                     <w:jc w:val="center"/>
                   </w:pPr>
                   <w:r>
@@ -2692,7 +2478,6 @@
                 <w:p>
                   <w:pPr>
                     <w:pStyle w:val="Compact"/>
-                    <w:jc w:val="left"/>
                     <w:jc w:val="center"/>
                   </w:pPr>
                   <w:r>
@@ -2707,7 +2492,6 @@
                 <w:p>
                   <w:pPr>
                     <w:pStyle w:val="Compact"/>
-                    <w:jc w:val="left"/>
                     <w:jc w:val="center"/>
                   </w:pPr>
                   <w:r>
@@ -2720,7 +2504,6 @@
                 <w:p>
                   <w:pPr>
                     <w:pStyle w:val="Compact"/>
-                    <w:jc w:val="left"/>
                     <w:jc w:val="center"/>
                   </w:pPr>
                   <w:r>
@@ -2733,7 +2516,6 @@
                 <w:p>
                   <w:pPr>
                     <w:pStyle w:val="Compact"/>
-                    <w:jc w:val="left"/>
                     <w:jc w:val="center"/>
                   </w:pPr>
                   <w:r>
@@ -2899,16 +2681,16 @@
     </w:p>
     <w:p>
       <w:pPr>
+        <w:pStyle w:val="Compact"/>
         <w:numPr>
           <w:ilvl w:val="0"/>
           <w:numId w:val="1001"/>
         </w:numPr>
-        <w:pStyle w:val="Compact"/>
       </w:pPr>
       <w:r>
         <w:rPr>
+          <w:b/>
           <w:bCs/>
-          <w:b/>
         </w:rPr>
         <w:t xml:space="preserve">National Tourism Data</w:t>
       </w:r>
@@ -2924,16 +2706,16 @@
     </w:p>
     <w:p>
       <w:pPr>
+        <w:pStyle w:val="Compact"/>
         <w:numPr>
           <w:ilvl w:val="0"/>
           <w:numId w:val="1001"/>
         </w:numPr>
-        <w:pStyle w:val="Compact"/>
       </w:pPr>
       <w:r>
         <w:rPr>
+          <w:b/>
           <w:bCs/>
-          <w:b/>
         </w:rPr>
         <w:t xml:space="preserve">Accommodation Infrastructure</w:t>
       </w:r>
@@ -3006,9 +2788,8 @@
       <w:tblPr>
         <w:tblStyle w:val="Table"/>
         <w:tblW w:type="pct" w:w="5000"/>
+        <w:tblLayout w:type="fixed"/>
         <w:tblLook w:firstRow="0" w:lastRow="0" w:firstColumn="0" w:lastColumn="0" w:noHBand="0" w:noVBand="0" w:val="0000"/>
-        <w:jc w:val="start"/>
-        <w:tblLayout w:type="fixed"/>
       </w:tblPr>
       <w:tblGrid>
         <w:gridCol w:w="7920"/>
@@ -3022,7 +2803,7 @@
               <w:jc w:val="center"/>
             </w:pPr>
             <w:pPr>
-              <w:jc w:val="start"/>
+              <w:jc w:val="left"/>
               <w:spacing w:before="200"/>
               <w:pStyle w:val="ImageCaption"/>
             </w:pPr>
@@ -3034,9 +2815,8 @@
             <w:tblPr>
               <w:tblStyle w:val="Table"/>
               <w:tblW w:type="pct" w:w="5000"/>
+              <w:tblLayout w:type="fixed"/>
               <w:tblLook w:firstRow="1" w:lastRow="0" w:firstColumn="0" w:lastColumn="0" w:noHBand="0" w:noVBand="0" w:val="0020"/>
-              <w:jc w:val="start"/>
-              <w:tblLayout w:type="fixed"/>
             </w:tblPr>
             <w:tblGrid>
               <w:gridCol w:w="2030"/>
@@ -3046,14 +2826,13 @@
             </w:tblGrid>
             <w:tr>
               <w:trPr>
-                <w:tblHeader w:val="true"/>
+                <w:tblHeader w:val="on"/>
               </w:trPr>
               <w:tc>
                 <w:tcPr/>
                 <w:p>
                   <w:pPr>
                     <w:pStyle w:val="Compact"/>
-                    <w:jc w:val="left"/>
                     <w:jc w:val="center"/>
                   </w:pPr>
                   <w:r>
@@ -3066,7 +2845,6 @@
                 <w:p>
                   <w:pPr>
                     <w:pStyle w:val="Compact"/>
-                    <w:jc w:val="left"/>
                     <w:jc w:val="center"/>
                   </w:pPr>
                   <w:r>
@@ -3079,7 +2857,6 @@
                 <w:p>
                   <w:pPr>
                     <w:pStyle w:val="Compact"/>
-                    <w:jc w:val="left"/>
                     <w:jc w:val="center"/>
                   </w:pPr>
                   <w:r>
@@ -3092,7 +2869,6 @@
                 <w:p>
                   <w:pPr>
                     <w:pStyle w:val="Compact"/>
-                    <w:jc w:val="left"/>
                     <w:jc w:val="center"/>
                   </w:pPr>
                   <w:r>
@@ -3107,7 +2883,6 @@
                 <w:p>
                   <w:pPr>
                     <w:pStyle w:val="Compact"/>
-                    <w:jc w:val="left"/>
                     <w:jc w:val="center"/>
                   </w:pPr>
                   <w:r>
@@ -3120,7 +2895,6 @@
                 <w:p>
                   <w:pPr>
                     <w:pStyle w:val="Compact"/>
-                    <w:jc w:val="left"/>
                     <w:jc w:val="center"/>
                   </w:pPr>
                   <w:r>
@@ -3133,7 +2907,6 @@
                 <w:p>
                   <w:pPr>
                     <w:pStyle w:val="Compact"/>
-                    <w:jc w:val="left"/>
                     <w:jc w:val="center"/>
                   </w:pPr>
                   <w:r>
@@ -3146,7 +2919,6 @@
                 <w:p>
                   <w:pPr>
                     <w:pStyle w:val="Compact"/>
-                    <w:jc w:val="left"/>
                     <w:jc w:val="center"/>
                   </w:pPr>
                   <w:r>
@@ -3161,7 +2933,6 @@
                 <w:p>
                   <w:pPr>
                     <w:pStyle w:val="Compact"/>
-                    <w:jc w:val="left"/>
                     <w:jc w:val="center"/>
                   </w:pPr>
                   <w:r>
@@ -3174,7 +2945,6 @@
                 <w:p>
                   <w:pPr>
                     <w:pStyle w:val="Compact"/>
-                    <w:jc w:val="left"/>
                     <w:jc w:val="center"/>
                   </w:pPr>
                   <w:r>
@@ -3187,7 +2957,6 @@
                 <w:p>
                   <w:pPr>
                     <w:pStyle w:val="Compact"/>
-                    <w:jc w:val="left"/>
                     <w:jc w:val="center"/>
                   </w:pPr>
                   <w:r>
@@ -3200,7 +2969,6 @@
                 <w:p>
                   <w:pPr>
                     <w:pStyle w:val="Compact"/>
-                    <w:jc w:val="left"/>
                     <w:jc w:val="center"/>
                   </w:pPr>
                   <w:r>
@@ -3215,7 +2983,6 @@
                 <w:p>
                   <w:pPr>
                     <w:pStyle w:val="Compact"/>
-                    <w:jc w:val="left"/>
                     <w:jc w:val="center"/>
                   </w:pPr>
                   <w:r>
@@ -3228,7 +2995,6 @@
                 <w:p>
                   <w:pPr>
                     <w:pStyle w:val="Compact"/>
-                    <w:jc w:val="left"/>
                     <w:jc w:val="center"/>
                   </w:pPr>
                   <w:r>
@@ -3241,7 +3007,6 @@
                 <w:p>
                   <w:pPr>
                     <w:pStyle w:val="Compact"/>
-                    <w:jc w:val="left"/>
                     <w:jc w:val="center"/>
                   </w:pPr>
                   <w:r>
@@ -3254,7 +3019,6 @@
                 <w:p>
                   <w:pPr>
                     <w:pStyle w:val="Compact"/>
-                    <w:jc w:val="left"/>
                     <w:jc w:val="center"/>
                   </w:pPr>
                   <w:r>
@@ -3269,7 +3033,6 @@
                 <w:p>
                   <w:pPr>
                     <w:pStyle w:val="Compact"/>
-                    <w:jc w:val="left"/>
                     <w:jc w:val="center"/>
                   </w:pPr>
                   <w:r>
@@ -3282,7 +3045,6 @@
                 <w:p>
                   <w:pPr>
                     <w:pStyle w:val="Compact"/>
-                    <w:jc w:val="left"/>
                     <w:jc w:val="center"/>
                   </w:pPr>
                   <w:r>
@@ -3295,7 +3057,6 @@
                 <w:p>
                   <w:pPr>
                     <w:pStyle w:val="Compact"/>
-                    <w:jc w:val="left"/>
                     <w:jc w:val="center"/>
                   </w:pPr>
                   <w:r>
@@ -3308,7 +3069,6 @@
                 <w:p>
                   <w:pPr>
                     <w:pStyle w:val="Compact"/>
-                    <w:jc w:val="left"/>
                     <w:jc w:val="center"/>
                   </w:pPr>
                   <w:r>
@@ -3323,7 +3083,6 @@
                 <w:p>
                   <w:pPr>
                     <w:pStyle w:val="Compact"/>
-                    <w:jc w:val="left"/>
                     <w:jc w:val="center"/>
                   </w:pPr>
                   <w:r>
@@ -3336,7 +3095,6 @@
                 <w:p>
                   <w:pPr>
                     <w:pStyle w:val="Compact"/>
-                    <w:jc w:val="left"/>
                     <w:jc w:val="center"/>
                   </w:pPr>
                   <w:r>
@@ -3349,7 +3107,6 @@
                 <w:p>
                   <w:pPr>
                     <w:pStyle w:val="Compact"/>
-                    <w:jc w:val="left"/>
                     <w:jc w:val="center"/>
                   </w:pPr>
                   <w:r>
@@ -3362,7 +3119,6 @@
                 <w:p>
                   <w:pPr>
                     <w:pStyle w:val="Compact"/>
-                    <w:jc w:val="left"/>
                     <w:jc w:val="center"/>
                   </w:pPr>
                   <w:r>
@@ -3377,7 +3133,6 @@
                 <w:p>
                   <w:pPr>
                     <w:pStyle w:val="Compact"/>
-                    <w:jc w:val="left"/>
                     <w:jc w:val="center"/>
                   </w:pPr>
                   <w:r>
@@ -3390,7 +3145,6 @@
                 <w:p>
                   <w:pPr>
                     <w:pStyle w:val="Compact"/>
-                    <w:jc w:val="left"/>
                     <w:jc w:val="center"/>
                   </w:pPr>
                   <w:r>
@@ -3403,7 +3157,6 @@
                 <w:p>
                   <w:pPr>
                     <w:pStyle w:val="Compact"/>
-                    <w:jc w:val="left"/>
                     <w:jc w:val="center"/>
                   </w:pPr>
                   <w:r>
@@ -3416,7 +3169,6 @@
                 <w:p>
                   <w:pPr>
                     <w:pStyle w:val="Compact"/>
-                    <w:jc w:val="left"/>
                     <w:jc w:val="center"/>
                   </w:pPr>
                   <w:r>
@@ -3431,7 +3183,6 @@
                 <w:p>
                   <w:pPr>
                     <w:pStyle w:val="Compact"/>
-                    <w:jc w:val="left"/>
                     <w:jc w:val="center"/>
                   </w:pPr>
                   <w:r>
@@ -3444,7 +3195,6 @@
                 <w:p>
                   <w:pPr>
                     <w:pStyle w:val="Compact"/>
-                    <w:jc w:val="left"/>
                     <w:jc w:val="center"/>
                   </w:pPr>
                   <w:r>
@@ -3457,7 +3207,6 @@
                 <w:p>
                   <w:pPr>
                     <w:pStyle w:val="Compact"/>
-                    <w:jc w:val="left"/>
                     <w:jc w:val="center"/>
                   </w:pPr>
                   <w:r>
@@ -3470,7 +3219,6 @@
                 <w:p>
                   <w:pPr>
                     <w:pStyle w:val="Compact"/>
-                    <w:jc w:val="left"/>
                     <w:jc w:val="center"/>
                   </w:pPr>
                   <w:r>
@@ -3674,9 +3422,8 @@
       <w:tblPr>
         <w:tblStyle w:val="Table"/>
         <w:tblW w:type="pct" w:w="5000"/>
+        <w:tblLayout w:type="fixed"/>
         <w:tblLook w:firstRow="0" w:lastRow="0" w:firstColumn="0" w:lastColumn="0" w:noHBand="0" w:noVBand="0" w:val="0000"/>
-        <w:jc w:val="start"/>
-        <w:tblLayout w:type="fixed"/>
       </w:tblPr>
       <w:tblGrid>
         <w:gridCol w:w="7920"/>
@@ -3738,7 +3485,7 @@
               <w:jc w:val="center"/>
             </w:pPr>
             <w:pPr>
-              <w:jc w:val="start"/>
+              <w:jc w:val="left"/>
               <w:spacing w:before="200"/>
               <w:pStyle w:val="ImageCaption"/>
             </w:pPr>
@@ -3754,9 +3501,8 @@
       <w:tblPr>
         <w:tblStyle w:val="Table"/>
         <w:tblW w:type="pct" w:w="5000"/>
+        <w:tblLayout w:type="fixed"/>
         <w:tblLook w:firstRow="0" w:lastRow="0" w:firstColumn="0" w:lastColumn="0" w:noHBand="0" w:noVBand="0" w:val="0000"/>
-        <w:jc w:val="start"/>
-        <w:tblLayout w:type="fixed"/>
       </w:tblPr>
       <w:tblGrid>
         <w:gridCol w:w="7920"/>
@@ -3818,7 +3564,7 @@
               <w:jc w:val="center"/>
             </w:pPr>
             <w:pPr>
-              <w:jc w:val="start"/>
+              <w:jc w:val="left"/>
               <w:spacing w:before="200"/>
               <w:pStyle w:val="ImageCaption"/>
             </w:pPr>
@@ -3834,9 +3580,8 @@
       <w:tblPr>
         <w:tblStyle w:val="Table"/>
         <w:tblW w:type="pct" w:w="5000"/>
+        <w:tblLayout w:type="fixed"/>
         <w:tblLook w:firstRow="0" w:lastRow="0" w:firstColumn="0" w:lastColumn="0" w:noHBand="0" w:noVBand="0" w:val="0000"/>
-        <w:jc w:val="start"/>
-        <w:tblLayout w:type="fixed"/>
       </w:tblPr>
       <w:tblGrid>
         <w:gridCol w:w="7920"/>
@@ -3898,7 +3643,7 @@
               <w:jc w:val="center"/>
             </w:pPr>
             <w:pPr>
-              <w:jc w:val="start"/>
+              <w:jc w:val="left"/>
               <w:spacing w:before="200"/>
               <w:pStyle w:val="ImageCaption"/>
             </w:pPr>
@@ -3914,9 +3659,8 @@
       <w:tblPr>
         <w:tblStyle w:val="Table"/>
         <w:tblW w:type="pct" w:w="5000"/>
+        <w:tblLayout w:type="fixed"/>
         <w:tblLook w:firstRow="0" w:lastRow="0" w:firstColumn="0" w:lastColumn="0" w:noHBand="0" w:noVBand="0" w:val="0000"/>
-        <w:jc w:val="start"/>
-        <w:tblLayout w:type="fixed"/>
       </w:tblPr>
       <w:tblGrid>
         <w:gridCol w:w="7920"/>
@@ -3978,7 +3722,7 @@
               <w:jc w:val="center"/>
             </w:pPr>
             <w:pPr>
-              <w:jc w:val="start"/>
+              <w:jc w:val="left"/>
               <w:spacing w:before="200"/>
               <w:pStyle w:val="ImageCaption"/>
             </w:pPr>
@@ -3994,9 +3738,8 @@
       <w:tblPr>
         <w:tblStyle w:val="Table"/>
         <w:tblW w:type="pct" w:w="5000"/>
+        <w:tblLayout w:type="fixed"/>
         <w:tblLook w:firstRow="0" w:lastRow="0" w:firstColumn="0" w:lastColumn="0" w:noHBand="0" w:noVBand="0" w:val="0000"/>
-        <w:jc w:val="start"/>
-        <w:tblLayout w:type="fixed"/>
       </w:tblPr>
       <w:tblGrid>
         <w:gridCol w:w="7920"/>
@@ -4058,7 +3801,7 @@
               <w:jc w:val="center"/>
             </w:pPr>
             <w:pPr>
-              <w:jc w:val="start"/>
+              <w:jc w:val="left"/>
               <w:spacing w:before="200"/>
               <w:pStyle w:val="ImageCaption"/>
             </w:pPr>
@@ -4074,9 +3817,8 @@
       <w:tblPr>
         <w:tblStyle w:val="Table"/>
         <w:tblW w:type="pct" w:w="5000"/>
+        <w:tblLayout w:type="fixed"/>
         <w:tblLook w:firstRow="0" w:lastRow="0" w:firstColumn="0" w:lastColumn="0" w:noHBand="0" w:noVBand="0" w:val="0000"/>
-        <w:jc w:val="start"/>
-        <w:tblLayout w:type="fixed"/>
       </w:tblPr>
       <w:tblGrid>
         <w:gridCol w:w="7920"/>
@@ -4138,7 +3880,7 @@
               <w:jc w:val="center"/>
             </w:pPr>
             <w:pPr>
-              <w:jc w:val="start"/>
+              <w:jc w:val="left"/>
               <w:spacing w:before="200"/>
               <w:pStyle w:val="ImageCaption"/>
             </w:pPr>
@@ -4164,9 +3906,8 @@
       <w:tblPr>
         <w:tblStyle w:val="Table"/>
         <w:tblW w:type="pct" w:w="5000"/>
+        <w:tblLayout w:type="fixed"/>
         <w:tblLook w:firstRow="0" w:lastRow="0" w:firstColumn="0" w:lastColumn="0" w:noHBand="0" w:noVBand="0" w:val="0000"/>
-        <w:jc w:val="start"/>
-        <w:tblLayout w:type="fixed"/>
       </w:tblPr>
       <w:tblGrid>
         <w:gridCol w:w="7920"/>
@@ -4180,7 +3921,7 @@
               <w:jc w:val="center"/>
             </w:pPr>
             <w:pPr>
-              <w:jc w:val="start"/>
+              <w:jc w:val="left"/>
               <w:spacing w:before="200"/>
               <w:pStyle w:val="ImageCaption"/>
             </w:pPr>
@@ -4192,9 +3933,8 @@
             <w:tblPr>
               <w:tblStyle w:val="Table"/>
               <w:tblW w:type="pct" w:w="5000"/>
+              <w:tblLayout w:type="fixed"/>
               <w:tblLook w:firstRow="1" w:lastRow="0" w:firstColumn="0" w:lastColumn="0" w:noHBand="0" w:noVBand="0" w:val="0020"/>
-              <w:jc w:val="start"/>
-              <w:tblLayout w:type="fixed"/>
             </w:tblPr>
             <w:tblGrid>
               <w:gridCol w:w="463"/>
@@ -4207,7 +3947,7 @@
             </w:tblGrid>
             <w:tr>
               <w:trPr>
-                <w:tblHeader w:val="true"/>
+                <w:tblHeader w:val="on"/>
               </w:trPr>
               <w:tc>
                 <w:tcPr/>
@@ -27473,14 +27213,6 @@
       </w:pPr>
       <w:r>
         <w:t xml:space="preserve">6. References</w:t>
-      </w:r>
-    </w:p>
-    <w:p>
-      <w:pPr>
-        <w:pStyle w:val="FirstParagraph"/>
-      </w:pPr>
-      <w:r>
-        <w:t xml:space="preserve">[References to be added]</w:t>
       </w:r>
     </w:p>
     <w:bookmarkStart w:id="105" w:name="refs"/>
@@ -27611,8 +27343,8 @@
       </w:r>
       <w:r>
         <w:rPr>
+          <w:i/>
           <w:iCs/>
-          <w:i/>
         </w:rPr>
         <w:t xml:space="preserve">Ecological Indicators</w:t>
       </w:r>
@@ -27726,8 +27458,8 @@
       </w:r>
       <w:r>
         <w:rPr>
+          <w:i/>
           <w:iCs/>
-          <w:i/>
         </w:rPr>
         <w:t xml:space="preserve">Environmental Research Letters</w:t>
       </w:r>
@@ -27832,127 +27564,127 @@
       </w:r>
       <w:r>
         <w:rPr>
+          <w:i/>
           <w:iCs/>
-          <w:i/>
         </w:rPr>
         <w:t xml:space="preserve">System of</w:t>
       </w:r>
       <w:r>
         <w:rPr>
+          <w:i/>
           <w:iCs/>
-          <w:i/>
         </w:rPr>
         <w:t xml:space="preserve"> </w:t>
       </w:r>
       <w:r>
         <w:rPr>
+          <w:i/>
           <w:iCs/>
-          <w:i/>
         </w:rPr>
         <w:t xml:space="preserve">E</w:t>
       </w:r>
       <w:r>
         <w:rPr>
+          <w:i/>
           <w:iCs/>
-          <w:i/>
         </w:rPr>
         <w:t xml:space="preserve">nvironmental-</w:t>
       </w:r>
       <w:r>
         <w:rPr>
+          <w:i/>
           <w:iCs/>
-          <w:i/>
         </w:rPr>
         <w:t xml:space="preserve">E</w:t>
       </w:r>
       <w:r>
         <w:rPr>
+          <w:i/>
           <w:iCs/>
-          <w:i/>
         </w:rPr>
         <w:t xml:space="preserve">conomic</w:t>
       </w:r>
       <w:r>
         <w:rPr>
+          <w:i/>
           <w:iCs/>
-          <w:i/>
         </w:rPr>
         <w:t xml:space="preserve"> </w:t>
       </w:r>
       <w:r>
         <w:rPr>
+          <w:i/>
           <w:iCs/>
-          <w:i/>
         </w:rPr>
         <w:t xml:space="preserve">A</w:t>
       </w:r>
       <w:r>
         <w:rPr>
+          <w:i/>
           <w:iCs/>
-          <w:i/>
         </w:rPr>
         <w:t xml:space="preserve">ccounting—</w:t>
       </w:r>
       <w:r>
         <w:rPr>
+          <w:i/>
           <w:iCs/>
-          <w:i/>
         </w:rPr>
         <w:t xml:space="preserve">E</w:t>
       </w:r>
       <w:r>
         <w:rPr>
+          <w:i/>
           <w:iCs/>
-          <w:i/>
         </w:rPr>
         <w:t xml:space="preserve">cosystem</w:t>
       </w:r>
       <w:r>
         <w:rPr>
+          <w:i/>
           <w:iCs/>
-          <w:i/>
         </w:rPr>
         <w:t xml:space="preserve"> </w:t>
       </w:r>
       <w:r>
         <w:rPr>
+          <w:i/>
           <w:iCs/>
-          <w:i/>
         </w:rPr>
         <w:t xml:space="preserve">A</w:t>
       </w:r>
       <w:r>
         <w:rPr>
+          <w:i/>
           <w:iCs/>
-          <w:i/>
         </w:rPr>
         <w:t xml:space="preserve">ccounting (</w:t>
       </w:r>
       <w:r>
         <w:rPr>
+          <w:i/>
           <w:iCs/>
-          <w:i/>
         </w:rPr>
         <w:t xml:space="preserve">SEEA</w:t>
       </w:r>
       <w:r>
         <w:rPr>
+          <w:i/>
           <w:iCs/>
-          <w:i/>
         </w:rPr>
         <w:t xml:space="preserve"> </w:t>
       </w:r>
       <w:r>
         <w:rPr>
+          <w:i/>
           <w:iCs/>
-          <w:i/>
         </w:rPr>
         <w:t xml:space="preserve">EA</w:t>
       </w:r>
       <w:r>
         <w:rPr>
+          <w:i/>
           <w:iCs/>
-          <w:i/>
         </w:rPr>
         <w:t xml:space="preserve">)</w:t>
       </w:r>
@@ -28030,8 +27762,8 @@
       </w:r>
       <w:r>
         <w:rPr>
+          <w:i/>
           <w:iCs/>
-          <w:i/>
         </w:rPr>
         <w:t xml:space="preserve">Ecological Modelling</w:t>
       </w:r>
@@ -28284,14 +28016,14 @@
     </w:lvl>
   </w:abstractNum>
   <w:abstractNum w:abstractNumId="990">
-    <w:nsid w:val="A990"/>
+    <w:nsid w:val="0000A990"/>
     <w:multiLevelType w:val="multilevel"/>
     <w:lvl w:ilvl="0">
       <w:numFmt w:val="bullet"/>
       <w:lvlText w:val=" "/>
       <w:lvlJc w:val="left"/>
       <w:pPr>
-        <w:ind w:left="720" w:hanging="480"/>
+        <w:ind w:left="720" w:hanging="360"/>
       </w:pPr>
     </w:lvl>
     <w:lvl w:ilvl="1">
@@ -28299,7 +28031,7 @@
       <w:lvlText w:val=" "/>
       <w:lvlJc w:val="left"/>
       <w:pPr>
-        <w:ind w:left="1440" w:hanging="480"/>
+        <w:ind w:left="1440" w:hanging="360"/>
       </w:pPr>
     </w:lvl>
     <w:lvl w:ilvl="2">
@@ -28307,7 +28039,7 @@
       <w:lvlText w:val=" "/>
       <w:lvlJc w:val="left"/>
       <w:pPr>
-        <w:ind w:left="2160" w:hanging="480"/>
+        <w:ind w:left="2160" w:hanging="360"/>
       </w:pPr>
     </w:lvl>
     <w:lvl w:ilvl="3">
@@ -28315,7 +28047,7 @@
       <w:lvlText w:val=" "/>
       <w:lvlJc w:val="left"/>
       <w:pPr>
-        <w:ind w:left="2880" w:hanging="480"/>
+        <w:ind w:left="2880" w:hanging="360"/>
       </w:pPr>
     </w:lvl>
     <w:lvl w:ilvl="4">
@@ -28323,7 +28055,7 @@
       <w:lvlText w:val=" "/>
       <w:lvlJc w:val="left"/>
       <w:pPr>
-        <w:ind w:left="3600" w:hanging="480"/>
+        <w:ind w:left="3600" w:hanging="360"/>
       </w:pPr>
     </w:lvl>
     <w:lvl w:ilvl="5">
@@ -28331,7 +28063,7 @@
       <w:lvlText w:val=" "/>
       <w:lvlJc w:val="left"/>
       <w:pPr>
-        <w:ind w:left="4320" w:hanging="480"/>
+        <w:ind w:left="4320" w:hanging="360"/>
       </w:pPr>
     </w:lvl>
     <w:lvl w:ilvl="6">
@@ -28339,7 +28071,7 @@
       <w:lvlText w:val=" "/>
       <w:lvlJc w:val="left"/>
       <w:pPr>
-        <w:ind w:left="5040" w:hanging="480"/>
+        <w:ind w:left="5040" w:hanging="360"/>
       </w:pPr>
     </w:lvl>
     <w:lvl w:ilvl="7">
@@ -28347,7 +28079,7 @@
       <w:lvlText w:val=" "/>
       <w:lvlJc w:val="left"/>
       <w:pPr>
-        <w:ind w:left="5760" w:hanging="480"/>
+        <w:ind w:left="5760" w:hanging="360"/>
       </w:pPr>
     </w:lvl>
     <w:lvl w:ilvl="8">
@@ -28355,84 +28087,111 @@
       <w:lvlText w:val=" "/>
       <w:lvlJc w:val="left"/>
       <w:pPr>
-        <w:ind w:left="6480" w:hanging="480"/>
+        <w:ind w:left="6480" w:hanging="360"/>
       </w:pPr>
     </w:lvl>
   </w:abstractNum>
   <w:abstractNum w:abstractNumId="991">
-    <w:nsid w:val="A991"/>
+    <w:nsid w:val="0000A991"/>
     <w:multiLevelType w:val="multilevel"/>
     <w:lvl w:ilvl="0">
       <w:numFmt w:val="bullet"/>
-      <w:lvlText w:val="•"/>
+      <w:lvlText w:val=""/>
       <w:lvlJc w:val="left"/>
       <w:pPr>
-        <w:ind w:left="720" w:hanging="480"/>
+        <w:ind w:left="720" w:hanging="360"/>
       </w:pPr>
+      <w:rPr>
+        <w:rFonts w:ascii="Symbol" w:hAnsi="Symbol" w:cs="Symbol" w:hint="default"/>
+      </w:rPr>
     </w:lvl>
     <w:lvl w:ilvl="1">
       <w:numFmt w:val="bullet"/>
-      <w:lvlText w:val="–"/>
+      <w:lvlText w:val="o"/>
       <w:lvlJc w:val="left"/>
       <w:pPr>
-        <w:ind w:left="1440" w:hanging="480"/>
+        <w:ind w:left="1440" w:hanging="360"/>
       </w:pPr>
+      <w:rPr>
+        <w:rFonts w:ascii="Courier New" w:hAnsi="Courier New" w:cs="Courier New" w:hint="default"/>
+      </w:rPr>
     </w:lvl>
     <w:lvl w:ilvl="2">
       <w:numFmt w:val="bullet"/>
-      <w:lvlText w:val="•"/>
+      <w:lvlText w:val=""/>
       <w:lvlJc w:val="left"/>
       <w:pPr>
-        <w:ind w:left="2160" w:hanging="480"/>
+        <w:ind w:left="2160" w:hanging="360"/>
       </w:pPr>
+      <w:rPr>
+        <w:rFonts w:ascii="Wingdings" w:hAnsi="Wingdings" w:cs="Wingdings" w:hint="default"/>
+      </w:rPr>
     </w:lvl>
     <w:lvl w:ilvl="3">
       <w:numFmt w:val="bullet"/>
-      <w:lvlText w:val="–"/>
+      <w:lvlText w:val=""/>
       <w:lvlJc w:val="left"/>
       <w:pPr>
-        <w:ind w:left="2880" w:hanging="480"/>
+        <w:ind w:left="2880" w:hanging="360"/>
       </w:pPr>
+      <w:rPr>
+        <w:rFonts w:ascii="Symbol" w:hAnsi="Symbol" w:cs="Symbol" w:hint="default"/>
+      </w:rPr>
     </w:lvl>
     <w:lvl w:ilvl="4">
       <w:numFmt w:val="bullet"/>
-      <w:lvlText w:val="•"/>
+      <w:lvlText w:val="o"/>
       <w:lvlJc w:val="left"/>
       <w:pPr>
-        <w:ind w:left="3600" w:hanging="480"/>
+        <w:ind w:left="3600" w:hanging="360"/>
       </w:pPr>
+      <w:rPr>
+        <w:rFonts w:ascii="Courier New" w:hAnsi="Courier New" w:cs="Courier New" w:hint="default"/>
+      </w:rPr>
     </w:lvl>
     <w:lvl w:ilvl="5">
       <w:numFmt w:val="bullet"/>
-      <w:lvlText w:val="–"/>
+      <w:lvlText w:val=""/>
       <w:lvlJc w:val="left"/>
       <w:pPr>
-        <w:ind w:left="4320" w:hanging="480"/>
+        <w:ind w:left="4320" w:hanging="360"/>
       </w:pPr>
+      <w:rPr>
+        <w:rFonts w:ascii="Wingdings" w:hAnsi="Wingdings" w:cs="Wingdings" w:hint="default"/>
+      </w:rPr>
     </w:lvl>
     <w:lvl w:ilvl="6">
       <w:numFmt w:val="bullet"/>
-      <w:lvlText w:val="•"/>
+      <w:lvlText w:val=""/>
       <w:lvlJc w:val="left"/>
       <w:pPr>
-        <w:ind w:left="5040" w:hanging="480"/>
+        <w:ind w:left="5040" w:hanging="360"/>
       </w:pPr>
+      <w:rPr>
+        <w:rFonts w:ascii="Symbol" w:hAnsi="Symbol" w:cs="Symbol" w:hint="default"/>
+      </w:rPr>
     </w:lvl>
     <w:lvl w:ilvl="7">
       <w:numFmt w:val="bullet"/>
-      <w:lvlText w:val="–"/>
+      <w:lvlText w:val="o"/>
       <w:lvlJc w:val="left"/>
       <w:pPr>
-        <w:ind w:left="5760" w:hanging="480"/>
+        <w:ind w:left="5760" w:hanging="360"/>
       </w:pPr>
+      <w:rPr>
+        <w:rFonts w:ascii="Courier New" w:hAnsi="Courier New" w:cs="Courier New" w:hint="default"/>
+      </w:rPr>
     </w:lvl>
     <w:lvl w:ilvl="8">
       <w:numFmt w:val="bullet"/>
-      <w:lvlText w:val="•"/>
+      <w:lvlText w:val=""/>
       <w:lvlJc w:val="left"/>
       <w:pPr>
-        <w:ind w:left="6480" w:hanging="480"/>
+        <w:ind w:left="6480" w:hanging="360"/>
       </w:pPr>
+      <w:rPr>
+        <w:rFonts w:ascii="Wingdings" w:hAnsi="Wingdings" w:cs="Wingdings" w:hint="default"/>
+      </w:rPr>
     </w:lvl>
   </w:abstractNum>
   <w:num w16cid:durableId="2021663979" w:numId="1">
@@ -29381,6 +29140,7 @@
     <w:name w:val="KeywordTok"/>
     <w:basedOn w:val="VerbatimChar"/>
     <w:rPr>
+      <w:b/>
       <w:color w:val="003b4f"/>
       <w:shd w:val="clear" w:fill="f1f3f5"/>
     </w:rPr>
@@ -29485,9 +29245,9 @@
     <w:name w:val="DocumentationTok"/>
     <w:basedOn w:val="VerbatimChar"/>
     <w:rPr>
+      <w:i/>
       <w:color w:val="5e5e5e"/>
       <w:shd w:val="clear" w:fill="f1f3f5"/>
-      <w:i/>
     </w:rPr>
   </w:style>
   <w:style w:type="character" w:customStyle="1" w:styleId="AnnotationTok">
@@ -29502,9 +29262,9 @@
     <w:name w:val="CommentVarTok"/>
     <w:basedOn w:val="VerbatimChar"/>
     <w:rPr>
+      <w:i/>
       <w:color w:val="5e5e5e"/>
       <w:shd w:val="clear" w:fill="f1f3f5"/>
-      <w:i/>
     </w:rPr>
   </w:style>
   <w:style w:type="character" w:customStyle="1" w:styleId="OtherTok">
@@ -29535,6 +29295,7 @@
     <w:name w:val="ControlFlowTok"/>
     <w:basedOn w:val="VerbatimChar"/>
     <w:rPr>
+      <w:b/>
       <w:color w:val="003b4f"/>
       <w:shd w:val="clear" w:fill="f1f3f5"/>
     </w:rPr>
@@ -29599,9 +29360,9 @@
     <w:name w:val="WarningTok"/>
     <w:basedOn w:val="VerbatimChar"/>
     <w:rPr>
+      <w:i/>
       <w:color w:val="5e5e5e"/>
       <w:shd w:val="clear" w:fill="f1f3f5"/>
-      <w:i/>
     </w:rPr>
   </w:style>
   <w:style w:type="character" w:customStyle="1" w:styleId="AlertTok">

</xml_diff>